<commit_message>
Contract: third signatory + terms-of-employment appendix
The signature table now has three columns side by side — the employee,
the signing manager, and Toni Risteski, President Sigma Technology
Software Solutions AB (overridable per offer via signer2Name/Title).
Columns shrink from 2x3860 to 3x2990 twips so the table still fits the
body width.

After the signatures the contract continues on a new page with the
English "Terms of employment and additional policies" (§ 1 – § 20). The
wording lives in templates/terms-of-employment.txt and is converted to
WordprocessingML by the template build script; the version-date line
from the source document is not included.

Co-Authored-By: Claude Opus 5 (1M context) <noreply@anthropic.com>
</commit_message>
<xml_diff>
--- a/templates/contract-template.docx
+++ b/templates/contract-template.docx
@@ -910,7 +910,7 @@
     </w:p>
     <w:tbl>
       <w:tblPr>
-        <w:tblW w:w="7720" w:type="dxa"/>
+        <w:tblW w:w="8970" w:type="dxa"/>
         <w:tblInd w:w="-108" w:type="dxa"/>
         <w:tblBorders>
           <w:top w:val="nil"/>
@@ -922,8 +922,9 @@
         <w:tblLook w:val="0000" w:firstRow="0" w:lastRow="0" w:firstColumn="0" w:lastColumn="0" w:noHBand="0" w:noVBand="0"/>
       </w:tblPr>
       <w:tblGrid>
-        <w:gridCol w:w="3860"/>
-        <w:gridCol w:w="3860"/>
+        <w:gridCol w:w="2990"/>
+        <w:gridCol w:w="2990"/>
+        <w:gridCol w:w="2990"/>
       </w:tblGrid>
       <w:tr>
         <w:trPr>
@@ -931,7 +932,7 @@
         </w:trPr>
         <w:tc>
           <w:tcPr>
-            <w:tcW w:w="3860" w:type="dxa"/>
+            <w:tcW w:w="2990" w:type="dxa"/>
           </w:tcPr>
           <w:p>
             <w:pPr>
@@ -973,7 +974,7 @@
         </w:tc>
         <w:tc>
           <w:tcPr>
-            <w:tcW w:w="3860" w:type="dxa"/>
+            <w:tcW w:w="2990" w:type="dxa"/>
           </w:tcPr>
           <w:p>
             <w:pPr>
@@ -1013,6 +1014,51 @@
             </w:r>
           </w:p>
         </w:tc>
+        <w:tc>
+          <w:tcPr>
+            <w:tcW w:w="2990" w:type="dxa"/>
+          </w:tcPr>
+          <w:p>
+            <w:pPr>
+              <w:pStyle w:val="Default"/>
+              <w:rPr>
+                <w:rFonts w:asciiTheme="minorHAnsi" w:eastAsia="Times New Roman" w:hAnsiTheme="minorHAnsi" w:cstheme="minorHAnsi"/>
+                <w:sz w:val="20"/>
+                <w:szCs w:val="20"/>
+                <w:lang w:eastAsia="sv-SE"/>
+              </w:rPr>
+            </w:pPr>
+            <w:r>
+              <w:rPr>
+                <w:rFonts w:asciiTheme="minorHAnsi" w:eastAsia="Times New Roman" w:hAnsiTheme="minorHAnsi" w:cstheme="minorHAnsi"/>
+                <w:sz w:val="20"/>
+                <w:szCs w:val="20"/>
+                <w:lang w:eastAsia="sv-SE"/>
+              </w:rPr>
+              <w:t xml:space="preserve">_________________________ </w:t>
+            </w:r>
+          </w:p>
+          <w:p>
+            <w:pPr>
+              <w:pStyle w:val="Default"/>
+              <w:rPr>
+                <w:rFonts w:asciiTheme="minorHAnsi" w:eastAsia="Times New Roman" w:hAnsiTheme="minorHAnsi" w:cstheme="minorHAnsi"/>
+                <w:sz w:val="20"/>
+                <w:szCs w:val="20"/>
+                <w:lang w:eastAsia="sv-SE"/>
+              </w:rPr>
+            </w:pPr>
+            <w:r>
+              <w:rPr>
+                <w:rFonts w:asciiTheme="minorHAnsi" w:eastAsia="Times New Roman" w:hAnsiTheme="minorHAnsi" w:cstheme="minorHAnsi"/>
+                <w:sz w:val="20"/>
+                <w:szCs w:val="20"/>
+                <w:lang w:eastAsia="sv-SE"/>
+              </w:rPr>
+              <w:t xml:space="preserve">{{SIGNER2_NAME}}</w:t>
+            </w:r>
+          </w:p>
+        </w:tc>
       </w:tr>
       <w:tr>
         <w:trPr>
@@ -1020,7 +1066,7 @@
         </w:trPr>
         <w:tc>
           <w:tcPr>
-            <w:tcW w:w="3860" w:type="dxa"/>
+            <w:tcW w:w="2990" w:type="dxa"/>
           </w:tcPr>
           <w:p>
             <w:pPr>
@@ -1043,7 +1089,7 @@
         </w:tc>
         <w:tc>
           <w:tcPr>
-            <w:tcW w:w="3860" w:type="dxa"/>
+            <w:tcW w:w="2990" w:type="dxa"/>
           </w:tcPr>
           <w:p>
             <w:pPr>
@@ -1065,6 +1111,31 @@
             </w:r>
           </w:p>
         </w:tc>
+        <w:tc>
+          <w:tcPr>
+            <w:tcW w:w="2990" w:type="dxa"/>
+          </w:tcPr>
+          <w:p>
+            <w:pPr>
+              <w:pStyle w:val="Default"/>
+              <w:rPr>
+                <w:rFonts w:asciiTheme="minorHAnsi" w:eastAsia="Times New Roman" w:hAnsiTheme="minorHAnsi" w:cstheme="minorHAnsi"/>
+                <w:sz w:val="20"/>
+                <w:szCs w:val="20"/>
+                <w:lang w:eastAsia="sv-SE"/>
+              </w:rPr>
+            </w:pPr>
+            <w:r>
+              <w:rPr>
+                <w:rFonts w:asciiTheme="minorHAnsi" w:eastAsia="Times New Roman" w:hAnsiTheme="minorHAnsi" w:cstheme="minorHAnsi"/>
+                <w:sz w:val="20"/>
+                <w:szCs w:val="20"/>
+                <w:lang w:eastAsia="sv-SE"/>
+              </w:rPr>
+              <w:t xml:space="preserve">{{SIGNER2_TITLE}}</w:t>
+            </w:r>
+          </w:p>
+        </w:tc>
       </w:tr>
     </w:tbl>
     <w:p>
@@ -1076,6 +1147,1649 @@
           <w:lang w:val="en-US" w:eastAsia="sv-SE"/>
         </w:rPr>
       </w:pPr>
+    </w:p>
+    <w:p>
+      <w:pPr>
+        <w:pageBreakBefore/>
+        <w:spacing w:before="0" w:after="240"/>
+        <w:rPr>
+          <w:rFonts w:asciiTheme="minorHAnsi" w:eastAsia="Times New Roman" w:hAnsiTheme="minorHAnsi" w:cstheme="minorHAnsi"/>
+          <w:b/>
+          <w:bCs/>
+          <w:sz w:val="28"/>
+          <w:szCs w:val="28"/>
+          <w:lang w:val="en-US" w:eastAsia="sv-SE"/>
+        </w:rPr>
+      </w:pPr>
+      <w:r>
+        <w:rPr>
+          <w:rFonts w:asciiTheme="minorHAnsi" w:eastAsia="Times New Roman" w:hAnsiTheme="minorHAnsi" w:cstheme="minorHAnsi"/>
+          <w:b/>
+          <w:bCs/>
+          <w:sz w:val="28"/>
+          <w:szCs w:val="28"/>
+          <w:lang w:val="en-US" w:eastAsia="sv-SE"/>
+        </w:rPr>
+        <w:t xml:space="preserve">TERMS OF EMPLOYMENT AND ADDITIONAL POLICIES</w:t>
+      </w:r>
+    </w:p>
+    <w:p>
+      <w:pPr>
+        <w:spacing w:before="0" w:after="120"/>
+        <w:rPr>
+          <w:rFonts w:asciiTheme="minorHAnsi" w:eastAsia="Times New Roman" w:hAnsiTheme="minorHAnsi" w:cstheme="minorHAnsi"/>
+          <w:sz w:val="20"/>
+          <w:szCs w:val="20"/>
+          <w:lang w:val="en-US" w:eastAsia="sv-SE"/>
+        </w:rPr>
+      </w:pPr>
+      <w:r>
+        <w:rPr>
+          <w:rFonts w:asciiTheme="minorHAnsi" w:eastAsia="Times New Roman" w:hAnsiTheme="minorHAnsi" w:cstheme="minorHAnsi"/>
+          <w:sz w:val="20"/>
+          <w:szCs w:val="20"/>
+          <w:lang w:val="en-US" w:eastAsia="sv-SE"/>
+        </w:rPr>
+        <w:t xml:space="preserve">Sigma Technology is a member of the Federation of Swedish Innovation Companies. As a member, Sigma follows the collective agreement Innovationsavtalet. This collective agreement has been signed by Innovationsföretagen och Unionen / Sveriges Ingenjörer / Sveriges Arkitekter.</w:t>
+      </w:r>
+    </w:p>
+    <w:p>
+      <w:pPr>
+        <w:spacing w:before="0" w:after="120"/>
+        <w:rPr>
+          <w:rFonts w:asciiTheme="minorHAnsi" w:eastAsia="Times New Roman" w:hAnsiTheme="minorHAnsi" w:cstheme="minorHAnsi"/>
+          <w:sz w:val="20"/>
+          <w:szCs w:val="20"/>
+          <w:lang w:val="en-US" w:eastAsia="sv-SE"/>
+        </w:rPr>
+      </w:pPr>
+      <w:r>
+        <w:rPr>
+          <w:rFonts w:asciiTheme="minorHAnsi" w:eastAsia="Times New Roman" w:hAnsiTheme="minorHAnsi" w:cstheme="minorHAnsi"/>
+          <w:sz w:val="20"/>
+          <w:szCs w:val="20"/>
+          <w:lang w:val="en-US" w:eastAsia="sv-SE"/>
+        </w:rPr>
+        <w:t xml:space="preserve">The terms of employment for Sigma Technology’s employees are regulated in this collective agreement. As a supplement, Sigma Technology has established a number of additional policies that concern employees’ benefits and duties.</w:t>
+      </w:r>
+    </w:p>
+    <w:p>
+      <w:pPr>
+        <w:spacing w:before="240" w:after="60"/>
+        <w:rPr>
+          <w:rFonts w:asciiTheme="minorHAnsi" w:eastAsia="Times New Roman" w:hAnsiTheme="minorHAnsi" w:cstheme="minorHAnsi"/>
+          <w:b/>
+          <w:bCs/>
+          <w:sz w:val="22"/>
+          <w:szCs w:val="22"/>
+          <w:lang w:val="en-US" w:eastAsia="sv-SE"/>
+        </w:rPr>
+      </w:pPr>
+      <w:r>
+        <w:rPr>
+          <w:rFonts w:asciiTheme="minorHAnsi" w:eastAsia="Times New Roman" w:hAnsiTheme="minorHAnsi" w:cstheme="minorHAnsi"/>
+          <w:b/>
+          <w:bCs/>
+          <w:sz w:val="22"/>
+          <w:szCs w:val="22"/>
+          <w:lang w:val="en-US" w:eastAsia="sv-SE"/>
+        </w:rPr>
+        <w:t xml:space="preserve">§ 1 Working hours</w:t>
+      </w:r>
+    </w:p>
+    <w:p>
+      <w:pPr>
+        <w:spacing w:before="0" w:after="120"/>
+        <w:rPr>
+          <w:rFonts w:asciiTheme="minorHAnsi" w:eastAsia="Times New Roman" w:hAnsiTheme="minorHAnsi" w:cstheme="minorHAnsi"/>
+          <w:sz w:val="20"/>
+          <w:szCs w:val="20"/>
+          <w:lang w:val="en-US" w:eastAsia="sv-SE"/>
+        </w:rPr>
+      </w:pPr>
+      <w:r>
+        <w:rPr>
+          <w:rFonts w:asciiTheme="minorHAnsi" w:eastAsia="Times New Roman" w:hAnsiTheme="minorHAnsi" w:cstheme="minorHAnsi"/>
+          <w:sz w:val="20"/>
+          <w:szCs w:val="20"/>
+          <w:lang w:val="en-US" w:eastAsia="sv-SE"/>
+        </w:rPr>
+        <w:t xml:space="preserve">The ordinary working week is 40 hours. Employees who work at client sites shall comply with clients’ applicable working hours. If a client’s working hours differ from the employer’s hours, time shall be either added or subtracted from the time bank as appropriate. Full days off are: Midsummer Eve, Christmas Eve and New Years Eve.</w:t>
+      </w:r>
+    </w:p>
+    <w:p>
+      <w:pPr>
+        <w:spacing w:before="240" w:after="60"/>
+        <w:rPr>
+          <w:rFonts w:asciiTheme="minorHAnsi" w:eastAsia="Times New Roman" w:hAnsiTheme="minorHAnsi" w:cstheme="minorHAnsi"/>
+          <w:b/>
+          <w:bCs/>
+          <w:sz w:val="22"/>
+          <w:szCs w:val="22"/>
+          <w:lang w:val="en-US" w:eastAsia="sv-SE"/>
+        </w:rPr>
+      </w:pPr>
+      <w:r>
+        <w:rPr>
+          <w:rFonts w:asciiTheme="minorHAnsi" w:eastAsia="Times New Roman" w:hAnsiTheme="minorHAnsi" w:cstheme="minorHAnsi"/>
+          <w:b/>
+          <w:bCs/>
+          <w:sz w:val="22"/>
+          <w:szCs w:val="22"/>
+          <w:lang w:val="en-US" w:eastAsia="sv-SE"/>
+        </w:rPr>
+        <w:t xml:space="preserve">§ 2 Flextime</w:t>
+      </w:r>
+    </w:p>
+    <w:p>
+      <w:pPr>
+        <w:spacing w:before="0" w:after="120"/>
+        <w:rPr>
+          <w:rFonts w:asciiTheme="minorHAnsi" w:eastAsia="Times New Roman" w:hAnsiTheme="minorHAnsi" w:cstheme="minorHAnsi"/>
+          <w:sz w:val="20"/>
+          <w:szCs w:val="20"/>
+          <w:lang w:val="en-US" w:eastAsia="sv-SE"/>
+        </w:rPr>
+      </w:pPr>
+      <w:r>
+        <w:rPr>
+          <w:rFonts w:asciiTheme="minorHAnsi" w:eastAsia="Times New Roman" w:hAnsiTheme="minorHAnsi" w:cstheme="minorHAnsi"/>
+          <w:b/>
+          <w:bCs/>
+          <w:sz w:val="20"/>
+          <w:szCs w:val="20"/>
+          <w:lang w:val="en-US" w:eastAsia="sv-SE"/>
+        </w:rPr>
+        <w:t xml:space="preserve">Ordinary working hours:</w:t>
+      </w:r>
+      <w:r>
+        <w:rPr>
+          <w:rFonts w:asciiTheme="minorHAnsi" w:eastAsia="Times New Roman" w:hAnsiTheme="minorHAnsi" w:cstheme="minorHAnsi"/>
+          <w:sz w:val="20"/>
+          <w:szCs w:val="20"/>
+          <w:lang w:val="en-US" w:eastAsia="sv-SE"/>
+        </w:rPr>
+        <w:t xml:space="preserve"> 08:00 – 17:00</w:t>
+      </w:r>
+    </w:p>
+    <w:p>
+      <w:pPr>
+        <w:spacing w:before="0" w:after="120"/>
+        <w:rPr>
+          <w:rFonts w:asciiTheme="minorHAnsi" w:eastAsia="Times New Roman" w:hAnsiTheme="minorHAnsi" w:cstheme="minorHAnsi"/>
+          <w:sz w:val="20"/>
+          <w:szCs w:val="20"/>
+          <w:lang w:val="en-US" w:eastAsia="sv-SE"/>
+        </w:rPr>
+      </w:pPr>
+      <w:r>
+        <w:rPr>
+          <w:rFonts w:asciiTheme="minorHAnsi" w:eastAsia="Times New Roman" w:hAnsiTheme="minorHAnsi" w:cstheme="minorHAnsi"/>
+          <w:b/>
+          <w:bCs/>
+          <w:sz w:val="20"/>
+          <w:szCs w:val="20"/>
+          <w:lang w:val="en-US" w:eastAsia="sv-SE"/>
+        </w:rPr>
+        <w:t xml:space="preserve">Lunch break:</w:t>
+      </w:r>
+      <w:r>
+        <w:rPr>
+          <w:rFonts w:asciiTheme="minorHAnsi" w:eastAsia="Times New Roman" w:hAnsiTheme="minorHAnsi" w:cstheme="minorHAnsi"/>
+          <w:sz w:val="20"/>
+          <w:szCs w:val="20"/>
+          <w:lang w:val="en-US" w:eastAsia="sv-SE"/>
+        </w:rPr>
+        <w:t xml:space="preserve"> 12:00 – 13:00</w:t>
+      </w:r>
+    </w:p>
+    <w:p>
+      <w:pPr>
+        <w:spacing w:before="0" w:after="120"/>
+        <w:rPr>
+          <w:rFonts w:asciiTheme="minorHAnsi" w:eastAsia="Times New Roman" w:hAnsiTheme="minorHAnsi" w:cstheme="minorHAnsi"/>
+          <w:sz w:val="20"/>
+          <w:szCs w:val="20"/>
+          <w:lang w:val="en-US" w:eastAsia="sv-SE"/>
+        </w:rPr>
+      </w:pPr>
+      <w:r>
+        <w:rPr>
+          <w:rFonts w:asciiTheme="minorHAnsi" w:eastAsia="Times New Roman" w:hAnsiTheme="minorHAnsi" w:cstheme="minorHAnsi"/>
+          <w:b/>
+          <w:bCs/>
+          <w:sz w:val="20"/>
+          <w:szCs w:val="20"/>
+          <w:lang w:val="en-US" w:eastAsia="sv-SE"/>
+        </w:rPr>
+        <w:t xml:space="preserve">Flex time:</w:t>
+      </w:r>
+      <w:r>
+        <w:rPr>
+          <w:rFonts w:asciiTheme="minorHAnsi" w:eastAsia="Times New Roman" w:hAnsiTheme="minorHAnsi" w:cstheme="minorHAnsi"/>
+          <w:sz w:val="20"/>
+          <w:szCs w:val="20"/>
+          <w:lang w:val="en-US" w:eastAsia="sv-SE"/>
+        </w:rPr>
+        <w:t xml:space="preserve"> 07:00 – 09:00, 11:30 – 13:30 and 16:00 – 18:00</w:t>
+      </w:r>
+    </w:p>
+    <w:p>
+      <w:pPr>
+        <w:spacing w:before="240" w:after="60"/>
+        <w:rPr>
+          <w:rFonts w:asciiTheme="minorHAnsi" w:eastAsia="Times New Roman" w:hAnsiTheme="minorHAnsi" w:cstheme="minorHAnsi"/>
+          <w:b/>
+          <w:bCs/>
+          <w:sz w:val="22"/>
+          <w:szCs w:val="22"/>
+          <w:lang w:val="en-US" w:eastAsia="sv-SE"/>
+        </w:rPr>
+      </w:pPr>
+      <w:r>
+        <w:rPr>
+          <w:rFonts w:asciiTheme="minorHAnsi" w:eastAsia="Times New Roman" w:hAnsiTheme="minorHAnsi" w:cstheme="minorHAnsi"/>
+          <w:b/>
+          <w:bCs/>
+          <w:sz w:val="22"/>
+          <w:szCs w:val="22"/>
+          <w:lang w:val="en-US" w:eastAsia="sv-SE"/>
+        </w:rPr>
+        <w:t xml:space="preserve">§ 3 Overtime compensation</w:t>
+      </w:r>
+    </w:p>
+    <w:p>
+      <w:pPr>
+        <w:spacing w:before="0" w:after="120"/>
+        <w:rPr>
+          <w:rFonts w:asciiTheme="minorHAnsi" w:eastAsia="Times New Roman" w:hAnsiTheme="minorHAnsi" w:cstheme="minorHAnsi"/>
+          <w:sz w:val="20"/>
+          <w:szCs w:val="20"/>
+          <w:lang w:val="en-US" w:eastAsia="sv-SE"/>
+        </w:rPr>
+      </w:pPr>
+      <w:r>
+        <w:rPr>
+          <w:rFonts w:asciiTheme="minorHAnsi" w:eastAsia="Times New Roman" w:hAnsiTheme="minorHAnsi" w:cstheme="minorHAnsi"/>
+          <w:b/>
+          <w:bCs/>
+          <w:sz w:val="20"/>
+          <w:szCs w:val="20"/>
+          <w:lang w:val="en-US" w:eastAsia="sv-SE"/>
+        </w:rPr>
+        <w:t xml:space="preserve">Overtime 1</w:t>
+      </w:r>
+    </w:p>
+    <w:p>
+      <w:pPr>
+        <w:spacing w:before="0" w:after="120"/>
+        <w:rPr>
+          <w:rFonts w:asciiTheme="minorHAnsi" w:eastAsia="Times New Roman" w:hAnsiTheme="minorHAnsi" w:cstheme="minorHAnsi"/>
+          <w:sz w:val="20"/>
+          <w:szCs w:val="20"/>
+          <w:lang w:val="en-US" w:eastAsia="sv-SE"/>
+        </w:rPr>
+      </w:pPr>
+      <w:r>
+        <w:rPr>
+          <w:rFonts w:asciiTheme="minorHAnsi" w:eastAsia="Times New Roman" w:hAnsiTheme="minorHAnsi" w:cstheme="minorHAnsi"/>
+          <w:sz w:val="20"/>
+          <w:szCs w:val="20"/>
+          <w:lang w:val="en-US" w:eastAsia="sv-SE"/>
+        </w:rPr>
+        <w:t xml:space="preserve">06:00 – 20:00, non-holiday Mondays through Fridays, under the condition that ordinary working hours have been observed.</w:t>
+      </w:r>
+    </w:p>
+    <w:p>
+      <w:pPr>
+        <w:spacing w:before="0" w:after="120"/>
+        <w:rPr>
+          <w:rFonts w:asciiTheme="minorHAnsi" w:eastAsia="Times New Roman" w:hAnsiTheme="minorHAnsi" w:cstheme="minorHAnsi"/>
+          <w:sz w:val="20"/>
+          <w:szCs w:val="20"/>
+          <w:lang w:val="en-US" w:eastAsia="sv-SE"/>
+        </w:rPr>
+      </w:pPr>
+      <w:r>
+        <w:rPr>
+          <w:rFonts w:asciiTheme="minorHAnsi" w:eastAsia="Times New Roman" w:hAnsiTheme="minorHAnsi" w:cstheme="minorHAnsi"/>
+          <w:b/>
+          <w:bCs/>
+          <w:sz w:val="20"/>
+          <w:szCs w:val="20"/>
+          <w:lang w:val="en-US" w:eastAsia="sv-SE"/>
+        </w:rPr>
+        <w:t xml:space="preserve">Overtime 2 (other times)</w:t>
+      </w:r>
+    </w:p>
+    <w:p>
+      <w:pPr>
+        <w:spacing w:before="0" w:after="120"/>
+        <w:rPr>
+          <w:rFonts w:asciiTheme="minorHAnsi" w:eastAsia="Times New Roman" w:hAnsiTheme="minorHAnsi" w:cstheme="minorHAnsi"/>
+          <w:sz w:val="20"/>
+          <w:szCs w:val="20"/>
+          <w:lang w:val="en-US" w:eastAsia="sv-SE"/>
+        </w:rPr>
+      </w:pPr>
+      <w:r>
+        <w:rPr>
+          <w:rFonts w:asciiTheme="minorHAnsi" w:eastAsia="Times New Roman" w:hAnsiTheme="minorHAnsi" w:cstheme="minorHAnsi"/>
+          <w:sz w:val="20"/>
+          <w:szCs w:val="20"/>
+          <w:lang w:val="en-US" w:eastAsia="sv-SE"/>
+        </w:rPr>
+        <w:t xml:space="preserve">Additional time only applies for part-time employees.</w:t>
+      </w:r>
+    </w:p>
+    <w:p>
+      <w:pPr>
+        <w:spacing w:before="0" w:after="120"/>
+        <w:rPr>
+          <w:rFonts w:asciiTheme="minorHAnsi" w:eastAsia="Times New Roman" w:hAnsiTheme="minorHAnsi" w:cstheme="minorHAnsi"/>
+          <w:sz w:val="20"/>
+          <w:szCs w:val="20"/>
+          <w:lang w:val="en-US" w:eastAsia="sv-SE"/>
+        </w:rPr>
+      </w:pPr>
+      <w:r>
+        <w:rPr>
+          <w:rFonts w:asciiTheme="minorHAnsi" w:eastAsia="Times New Roman" w:hAnsiTheme="minorHAnsi" w:cstheme="minorHAnsi"/>
+          <w:sz w:val="20"/>
+          <w:szCs w:val="20"/>
+          <w:lang w:val="en-US" w:eastAsia="sv-SE"/>
+        </w:rPr>
+        <w:t xml:space="preserve">Keep in mind that overtime must always be ordered. Check with your manager.</w:t>
+      </w:r>
+    </w:p>
+    <w:p>
+      <w:pPr>
+        <w:spacing w:before="240" w:after="60"/>
+        <w:rPr>
+          <w:rFonts w:asciiTheme="minorHAnsi" w:eastAsia="Times New Roman" w:hAnsiTheme="minorHAnsi" w:cstheme="minorHAnsi"/>
+          <w:b/>
+          <w:bCs/>
+          <w:sz w:val="22"/>
+          <w:szCs w:val="22"/>
+          <w:lang w:val="en-US" w:eastAsia="sv-SE"/>
+        </w:rPr>
+      </w:pPr>
+      <w:r>
+        <w:rPr>
+          <w:rFonts w:asciiTheme="minorHAnsi" w:eastAsia="Times New Roman" w:hAnsiTheme="minorHAnsi" w:cstheme="minorHAnsi"/>
+          <w:b/>
+          <w:bCs/>
+          <w:sz w:val="22"/>
+          <w:szCs w:val="22"/>
+          <w:lang w:val="en-US" w:eastAsia="sv-SE"/>
+        </w:rPr>
+        <w:t xml:space="preserve">§ 4 Time bank</w:t>
+      </w:r>
+    </w:p>
+    <w:p>
+      <w:pPr>
+        <w:spacing w:before="0" w:after="120"/>
+        <w:rPr>
+          <w:rFonts w:asciiTheme="minorHAnsi" w:eastAsia="Times New Roman" w:hAnsiTheme="minorHAnsi" w:cstheme="minorHAnsi"/>
+          <w:sz w:val="20"/>
+          <w:szCs w:val="20"/>
+          <w:lang w:val="en-US" w:eastAsia="sv-SE"/>
+        </w:rPr>
+      </w:pPr>
+      <w:r>
+        <w:rPr>
+          <w:rFonts w:asciiTheme="minorHAnsi" w:eastAsia="Times New Roman" w:hAnsiTheme="minorHAnsi" w:cstheme="minorHAnsi"/>
+          <w:sz w:val="20"/>
+          <w:szCs w:val="20"/>
+          <w:lang w:val="en-US" w:eastAsia="sv-SE"/>
+        </w:rPr>
+        <w:t xml:space="preserve">The regular time bank may vary between a deficit of 40 hours and an 80 hour surplus. Deviations can be made subject to approval by your manager.</w:t>
+      </w:r>
+    </w:p>
+    <w:p>
+      <w:pPr>
+        <w:spacing w:before="0" w:after="120"/>
+        <w:rPr>
+          <w:rFonts w:asciiTheme="minorHAnsi" w:eastAsia="Times New Roman" w:hAnsiTheme="minorHAnsi" w:cstheme="minorHAnsi"/>
+          <w:sz w:val="20"/>
+          <w:szCs w:val="20"/>
+          <w:lang w:val="en-US" w:eastAsia="sv-SE"/>
+        </w:rPr>
+      </w:pPr>
+      <w:r>
+        <w:rPr>
+          <w:rFonts w:asciiTheme="minorHAnsi" w:eastAsia="Times New Roman" w:hAnsiTheme="minorHAnsi" w:cstheme="minorHAnsi"/>
+          <w:sz w:val="20"/>
+          <w:szCs w:val="20"/>
+          <w:lang w:val="en-US" w:eastAsia="sv-SE"/>
+        </w:rPr>
+        <w:t xml:space="preserve">Time spent on internal assignments after ordinary working hours may not be saved in the time bank, but is instead reimbursed immediately as wages.</w:t>
+      </w:r>
+    </w:p>
+    <w:p>
+      <w:pPr>
+        <w:spacing w:before="0" w:after="120"/>
+        <w:rPr>
+          <w:rFonts w:asciiTheme="minorHAnsi" w:eastAsia="Times New Roman" w:hAnsiTheme="minorHAnsi" w:cstheme="minorHAnsi"/>
+          <w:sz w:val="20"/>
+          <w:szCs w:val="20"/>
+          <w:lang w:val="en-US" w:eastAsia="sv-SE"/>
+        </w:rPr>
+      </w:pPr>
+      <w:r>
+        <w:rPr>
+          <w:rFonts w:asciiTheme="minorHAnsi" w:eastAsia="Times New Roman" w:hAnsiTheme="minorHAnsi" w:cstheme="minorHAnsi"/>
+          <w:b/>
+          <w:bCs/>
+          <w:sz w:val="20"/>
+          <w:szCs w:val="20"/>
+          <w:lang w:val="en-US" w:eastAsia="sv-SE"/>
+        </w:rPr>
+        <w:t xml:space="preserve">Special annual time bank – no overtime</w:t>
+      </w:r>
+    </w:p>
+    <w:p>
+      <w:pPr>
+        <w:spacing w:before="0" w:after="120"/>
+        <w:rPr>
+          <w:rFonts w:asciiTheme="minorHAnsi" w:eastAsia="Times New Roman" w:hAnsiTheme="minorHAnsi" w:cstheme="minorHAnsi"/>
+          <w:sz w:val="20"/>
+          <w:szCs w:val="20"/>
+          <w:lang w:val="en-US" w:eastAsia="sv-SE"/>
+        </w:rPr>
+      </w:pPr>
+      <w:r>
+        <w:rPr>
+          <w:rFonts w:asciiTheme="minorHAnsi" w:eastAsia="Times New Roman" w:hAnsiTheme="minorHAnsi" w:cstheme="minorHAnsi"/>
+          <w:sz w:val="20"/>
+          <w:szCs w:val="20"/>
+          <w:lang w:val="en-US" w:eastAsia="sv-SE"/>
+        </w:rPr>
+        <w:t xml:space="preserve">For some senior employees who have contractually agreed to have included overtime and special annual time bank, the following time bank rules apply:</w:t>
+      </w:r>
+    </w:p>
+    <w:p>
+      <w:pPr>
+        <w:spacing w:before="0" w:after="40"/>
+        <w:ind w:left="360"/>
+        <w:rPr>
+          <w:rFonts w:asciiTheme="minorHAnsi" w:eastAsia="Times New Roman" w:hAnsiTheme="minorHAnsi" w:cstheme="minorHAnsi"/>
+          <w:sz w:val="20"/>
+          <w:szCs w:val="20"/>
+          <w:lang w:val="en-US" w:eastAsia="sv-SE"/>
+        </w:rPr>
+      </w:pPr>
+      <w:r>
+        <w:rPr>
+          <w:rFonts w:asciiTheme="minorHAnsi" w:eastAsia="Times New Roman" w:hAnsiTheme="minorHAnsi" w:cstheme="minorHAnsi"/>
+          <w:sz w:val="20"/>
+          <w:szCs w:val="20"/>
+          <w:lang w:val="en-US" w:eastAsia="sv-SE"/>
+        </w:rPr>
+        <w:t xml:space="preserve">• Time bank may vary between deficit 16 hours and surplus 40 hours (+40, -16 hours)</w:t>
+      </w:r>
+    </w:p>
+    <w:p>
+      <w:pPr>
+        <w:spacing w:before="0" w:after="40"/>
+        <w:ind w:left="360"/>
+        <w:rPr>
+          <w:rFonts w:asciiTheme="minorHAnsi" w:eastAsia="Times New Roman" w:hAnsiTheme="minorHAnsi" w:cstheme="minorHAnsi"/>
+          <w:sz w:val="20"/>
+          <w:szCs w:val="20"/>
+          <w:lang w:val="en-US" w:eastAsia="sv-SE"/>
+        </w:rPr>
+      </w:pPr>
+      <w:r>
+        <w:rPr>
+          <w:rFonts w:asciiTheme="minorHAnsi" w:eastAsia="Times New Roman" w:hAnsiTheme="minorHAnsi" w:cstheme="minorHAnsi"/>
+          <w:sz w:val="20"/>
+          <w:szCs w:val="20"/>
+          <w:lang w:val="en-US" w:eastAsia="sv-SE"/>
+        </w:rPr>
+        <w:t xml:space="preserve">• The time bank is balanced out at every year end:</w:t>
+      </w:r>
+    </w:p>
+    <w:p>
+      <w:pPr>
+        <w:spacing w:before="0" w:after="40"/>
+        <w:ind w:left="720"/>
+        <w:rPr>
+          <w:rFonts w:asciiTheme="minorHAnsi" w:eastAsia="Times New Roman" w:hAnsiTheme="minorHAnsi" w:cstheme="minorHAnsi"/>
+          <w:sz w:val="20"/>
+          <w:szCs w:val="20"/>
+          <w:lang w:val="en-US" w:eastAsia="sv-SE"/>
+        </w:rPr>
+      </w:pPr>
+      <w:r>
+        <w:rPr>
+          <w:rFonts w:asciiTheme="minorHAnsi" w:eastAsia="Times New Roman" w:hAnsiTheme="minorHAnsi" w:cstheme="minorHAnsi"/>
+          <w:sz w:val="20"/>
+          <w:szCs w:val="20"/>
+          <w:lang w:val="en-US" w:eastAsia="sv-SE"/>
+        </w:rPr>
+        <w:t xml:space="preserve">o Deficit will be deducted from salary</w:t>
+      </w:r>
+    </w:p>
+    <w:p>
+      <w:pPr>
+        <w:spacing w:before="0" w:after="40"/>
+        <w:ind w:left="720"/>
+        <w:rPr>
+          <w:rFonts w:asciiTheme="minorHAnsi" w:eastAsia="Times New Roman" w:hAnsiTheme="minorHAnsi" w:cstheme="minorHAnsi"/>
+          <w:sz w:val="20"/>
+          <w:szCs w:val="20"/>
+          <w:lang w:val="en-US" w:eastAsia="sv-SE"/>
+        </w:rPr>
+      </w:pPr>
+      <w:r>
+        <w:rPr>
+          <w:rFonts w:asciiTheme="minorHAnsi" w:eastAsia="Times New Roman" w:hAnsiTheme="minorHAnsi" w:cstheme="minorHAnsi"/>
+          <w:sz w:val="20"/>
+          <w:szCs w:val="20"/>
+          <w:lang w:val="en-US" w:eastAsia="sv-SE"/>
+        </w:rPr>
+        <w:t xml:space="preserve">o Surplus will be paid out as salary</w:t>
+      </w:r>
+    </w:p>
+    <w:p>
+      <w:pPr>
+        <w:spacing w:before="240" w:after="60"/>
+        <w:rPr>
+          <w:rFonts w:asciiTheme="minorHAnsi" w:eastAsia="Times New Roman" w:hAnsiTheme="minorHAnsi" w:cstheme="minorHAnsi"/>
+          <w:b/>
+          <w:bCs/>
+          <w:sz w:val="22"/>
+          <w:szCs w:val="22"/>
+          <w:lang w:val="en-US" w:eastAsia="sv-SE"/>
+        </w:rPr>
+      </w:pPr>
+      <w:r>
+        <w:rPr>
+          <w:rFonts w:asciiTheme="minorHAnsi" w:eastAsia="Times New Roman" w:hAnsiTheme="minorHAnsi" w:cstheme="minorHAnsi"/>
+          <w:b/>
+          <w:bCs/>
+          <w:sz w:val="22"/>
+          <w:szCs w:val="22"/>
+          <w:lang w:val="en-US" w:eastAsia="sv-SE"/>
+        </w:rPr>
+        <w:t xml:space="preserve">§ 5 Time off</w:t>
+      </w:r>
+    </w:p>
+    <w:p>
+      <w:pPr>
+        <w:spacing w:before="0" w:after="120"/>
+        <w:rPr>
+          <w:rFonts w:asciiTheme="minorHAnsi" w:eastAsia="Times New Roman" w:hAnsiTheme="minorHAnsi" w:cstheme="minorHAnsi"/>
+          <w:sz w:val="20"/>
+          <w:szCs w:val="20"/>
+          <w:lang w:val="en-US" w:eastAsia="sv-SE"/>
+        </w:rPr>
+      </w:pPr>
+      <w:r>
+        <w:rPr>
+          <w:rFonts w:asciiTheme="minorHAnsi" w:eastAsia="Times New Roman" w:hAnsiTheme="minorHAnsi" w:cstheme="minorHAnsi"/>
+          <w:sz w:val="20"/>
+          <w:szCs w:val="20"/>
+          <w:lang w:val="en-US" w:eastAsia="sv-SE"/>
+        </w:rPr>
+        <w:t xml:space="preserve">Your manager shall be informed of all time off. If you are working at a client site, you must notify your client.</w:t>
+      </w:r>
+    </w:p>
+    <w:p>
+      <w:pPr>
+        <w:spacing w:before="0" w:after="120"/>
+        <w:rPr>
+          <w:rFonts w:asciiTheme="minorHAnsi" w:eastAsia="Times New Roman" w:hAnsiTheme="minorHAnsi" w:cstheme="minorHAnsi"/>
+          <w:sz w:val="20"/>
+          <w:szCs w:val="20"/>
+          <w:lang w:val="en-US" w:eastAsia="sv-SE"/>
+        </w:rPr>
+      </w:pPr>
+      <w:r>
+        <w:rPr>
+          <w:rFonts w:asciiTheme="minorHAnsi" w:eastAsia="Times New Roman" w:hAnsiTheme="minorHAnsi" w:cstheme="minorHAnsi"/>
+          <w:b/>
+          <w:bCs/>
+          <w:sz w:val="20"/>
+          <w:szCs w:val="20"/>
+          <w:lang w:val="en-US" w:eastAsia="sv-SE"/>
+        </w:rPr>
+        <w:t xml:space="preserve">Vacation:</w:t>
+      </w:r>
+      <w:r>
+        <w:rPr>
+          <w:rFonts w:asciiTheme="minorHAnsi" w:eastAsia="Times New Roman" w:hAnsiTheme="minorHAnsi" w:cstheme="minorHAnsi"/>
+          <w:sz w:val="20"/>
+          <w:szCs w:val="20"/>
+          <w:lang w:val="en-US" w:eastAsia="sv-SE"/>
+        </w:rPr>
+        <w:t xml:space="preserve"> The primary vacation (summer) follows the rules posted on the extranet. For vacation on other occasions, agreement shall be reached with your manager.</w:t>
+      </w:r>
+    </w:p>
+    <w:p>
+      <w:pPr>
+        <w:spacing w:before="0" w:after="120"/>
+        <w:rPr>
+          <w:rFonts w:asciiTheme="minorHAnsi" w:eastAsia="Times New Roman" w:hAnsiTheme="minorHAnsi" w:cstheme="minorHAnsi"/>
+          <w:sz w:val="20"/>
+          <w:szCs w:val="20"/>
+          <w:lang w:val="en-US" w:eastAsia="sv-SE"/>
+        </w:rPr>
+      </w:pPr>
+      <w:r>
+        <w:rPr>
+          <w:rFonts w:asciiTheme="minorHAnsi" w:eastAsia="Times New Roman" w:hAnsiTheme="minorHAnsi" w:cstheme="minorHAnsi"/>
+          <w:b/>
+          <w:bCs/>
+          <w:sz w:val="20"/>
+          <w:szCs w:val="20"/>
+          <w:lang w:val="en-US" w:eastAsia="sv-SE"/>
+        </w:rPr>
+        <w:t xml:space="preserve">Parental leave:</w:t>
+      </w:r>
+      <w:r>
+        <w:rPr>
+          <w:rFonts w:asciiTheme="minorHAnsi" w:eastAsia="Times New Roman" w:hAnsiTheme="minorHAnsi" w:cstheme="minorHAnsi"/>
+          <w:sz w:val="20"/>
+          <w:szCs w:val="20"/>
+          <w:lang w:val="en-US" w:eastAsia="sv-SE"/>
+        </w:rPr>
+        <w:t xml:space="preserve"> A written application is required on a special form that must be approved by your manager. The form is available in the Management System under Document and Templates. For more information regarding payment during parental leave, contact your salary contact person.</w:t>
+      </w:r>
+    </w:p>
+    <w:p>
+      <w:pPr>
+        <w:spacing w:before="0" w:after="120"/>
+        <w:rPr>
+          <w:rFonts w:asciiTheme="minorHAnsi" w:eastAsia="Times New Roman" w:hAnsiTheme="minorHAnsi" w:cstheme="minorHAnsi"/>
+          <w:sz w:val="20"/>
+          <w:szCs w:val="20"/>
+          <w:lang w:val="en-US" w:eastAsia="sv-SE"/>
+        </w:rPr>
+      </w:pPr>
+      <w:r>
+        <w:rPr>
+          <w:rFonts w:asciiTheme="minorHAnsi" w:eastAsia="Times New Roman" w:hAnsiTheme="minorHAnsi" w:cstheme="minorHAnsi"/>
+          <w:b/>
+          <w:bCs/>
+          <w:sz w:val="20"/>
+          <w:szCs w:val="20"/>
+          <w:lang w:val="en-US" w:eastAsia="sv-SE"/>
+        </w:rPr>
+        <w:t xml:space="preserve">Leave of absence:</w:t>
+      </w:r>
+      <w:r>
+        <w:rPr>
+          <w:rFonts w:asciiTheme="minorHAnsi" w:eastAsia="Times New Roman" w:hAnsiTheme="minorHAnsi" w:cstheme="minorHAnsi"/>
+          <w:sz w:val="20"/>
+          <w:szCs w:val="20"/>
+          <w:lang w:val="en-US" w:eastAsia="sv-SE"/>
+        </w:rPr>
+        <w:t xml:space="preserve"> A written application is required on a special form that must be approved by your manager. The form is available in the Management System under Document and Templates.</w:t>
+      </w:r>
+    </w:p>
+    <w:p>
+      <w:pPr>
+        <w:spacing w:before="0" w:after="120"/>
+        <w:rPr>
+          <w:rFonts w:asciiTheme="minorHAnsi" w:eastAsia="Times New Roman" w:hAnsiTheme="minorHAnsi" w:cstheme="minorHAnsi"/>
+          <w:sz w:val="20"/>
+          <w:szCs w:val="20"/>
+          <w:lang w:val="en-US" w:eastAsia="sv-SE"/>
+        </w:rPr>
+      </w:pPr>
+      <w:r>
+        <w:rPr>
+          <w:rFonts w:asciiTheme="minorHAnsi" w:eastAsia="Times New Roman" w:hAnsiTheme="minorHAnsi" w:cstheme="minorHAnsi"/>
+          <w:b/>
+          <w:bCs/>
+          <w:sz w:val="20"/>
+          <w:szCs w:val="20"/>
+          <w:lang w:val="en-US" w:eastAsia="sv-SE"/>
+        </w:rPr>
+        <w:t xml:space="preserve">Compensatory leave:</w:t>
+      </w:r>
+      <w:r>
+        <w:rPr>
+          <w:rFonts w:asciiTheme="minorHAnsi" w:eastAsia="Times New Roman" w:hAnsiTheme="minorHAnsi" w:cstheme="minorHAnsi"/>
+          <w:sz w:val="20"/>
+          <w:szCs w:val="20"/>
+          <w:lang w:val="en-US" w:eastAsia="sv-SE"/>
+        </w:rPr>
+        <w:t xml:space="preserve"> Agreement shall be reached with your manager.</w:t>
+      </w:r>
+    </w:p>
+    <w:p>
+      <w:pPr>
+        <w:spacing w:before="0" w:after="120"/>
+        <w:rPr>
+          <w:rFonts w:asciiTheme="minorHAnsi" w:eastAsia="Times New Roman" w:hAnsiTheme="minorHAnsi" w:cstheme="minorHAnsi"/>
+          <w:sz w:val="20"/>
+          <w:szCs w:val="20"/>
+          <w:lang w:val="en-US" w:eastAsia="sv-SE"/>
+        </w:rPr>
+      </w:pPr>
+      <w:r>
+        <w:rPr>
+          <w:rFonts w:asciiTheme="minorHAnsi" w:eastAsia="Times New Roman" w:hAnsiTheme="minorHAnsi" w:cstheme="minorHAnsi"/>
+          <w:b/>
+          <w:bCs/>
+          <w:sz w:val="20"/>
+          <w:szCs w:val="20"/>
+          <w:lang w:val="en-US" w:eastAsia="sv-SE"/>
+        </w:rPr>
+        <w:t xml:space="preserve">Leave of absence with pay:</w:t>
+      </w:r>
+      <w:r>
+        <w:rPr>
+          <w:rFonts w:asciiTheme="minorHAnsi" w:eastAsia="Times New Roman" w:hAnsiTheme="minorHAnsi" w:cstheme="minorHAnsi"/>
+          <w:sz w:val="20"/>
+          <w:szCs w:val="20"/>
+          <w:lang w:val="en-US" w:eastAsia="sv-SE"/>
+        </w:rPr>
+        <w:t xml:space="preserve"> Paid leave of absence is time off without wage deductions and is granted by your manager. Employees have the right to paid leave of absence in the event of a sudden illness in the family and in conjunction with the death of a close relative. Close relatives are considered to be spouses/live-in partners, children, siblings and parents.</w:t>
+      </w:r>
+    </w:p>
+    <w:p>
+      <w:pPr>
+        <w:spacing w:before="0" w:after="120"/>
+        <w:rPr>
+          <w:rFonts w:asciiTheme="minorHAnsi" w:eastAsia="Times New Roman" w:hAnsiTheme="minorHAnsi" w:cstheme="minorHAnsi"/>
+          <w:sz w:val="20"/>
+          <w:szCs w:val="20"/>
+          <w:lang w:val="en-US" w:eastAsia="sv-SE"/>
+        </w:rPr>
+      </w:pPr>
+      <w:r>
+        <w:rPr>
+          <w:rFonts w:asciiTheme="minorHAnsi" w:eastAsia="Times New Roman" w:hAnsiTheme="minorHAnsi" w:cstheme="minorHAnsi"/>
+          <w:sz w:val="20"/>
+          <w:szCs w:val="20"/>
+          <w:lang w:val="en-US" w:eastAsia="sv-SE"/>
+        </w:rPr>
+        <w:t xml:space="preserve">Leave can also be granted for emergency medical care. Leaves are limited to no more than one day.</w:t>
+      </w:r>
+    </w:p>
+    <w:p>
+      <w:pPr>
+        <w:spacing w:before="240" w:after="60"/>
+        <w:rPr>
+          <w:rFonts w:asciiTheme="minorHAnsi" w:eastAsia="Times New Roman" w:hAnsiTheme="minorHAnsi" w:cstheme="minorHAnsi"/>
+          <w:b/>
+          <w:bCs/>
+          <w:sz w:val="22"/>
+          <w:szCs w:val="22"/>
+          <w:lang w:val="en-US" w:eastAsia="sv-SE"/>
+        </w:rPr>
+      </w:pPr>
+      <w:r>
+        <w:rPr>
+          <w:rFonts w:asciiTheme="minorHAnsi" w:eastAsia="Times New Roman" w:hAnsiTheme="minorHAnsi" w:cstheme="minorHAnsi"/>
+          <w:b/>
+          <w:bCs/>
+          <w:sz w:val="22"/>
+          <w:szCs w:val="22"/>
+          <w:lang w:val="en-US" w:eastAsia="sv-SE"/>
+        </w:rPr>
+        <w:t xml:space="preserve">§ 6 Vacation</w:t>
+      </w:r>
+    </w:p>
+    <w:p>
+      <w:pPr>
+        <w:spacing w:before="0" w:after="120"/>
+        <w:rPr>
+          <w:rFonts w:asciiTheme="minorHAnsi" w:eastAsia="Times New Roman" w:hAnsiTheme="minorHAnsi" w:cstheme="minorHAnsi"/>
+          <w:sz w:val="20"/>
+          <w:szCs w:val="20"/>
+          <w:lang w:val="en-US" w:eastAsia="sv-SE"/>
+        </w:rPr>
+      </w:pPr>
+      <w:r>
+        <w:rPr>
+          <w:rFonts w:asciiTheme="minorHAnsi" w:eastAsia="Times New Roman" w:hAnsiTheme="minorHAnsi" w:cstheme="minorHAnsi"/>
+          <w:sz w:val="20"/>
+          <w:szCs w:val="20"/>
+          <w:lang w:val="en-US" w:eastAsia="sv-SE"/>
+        </w:rPr>
+        <w:t xml:space="preserve">The vacation year extends from 1 April to 31 March. The immediately preceding 12-month period constitutes the accruement year.</w:t>
+      </w:r>
+    </w:p>
+    <w:p>
+      <w:pPr>
+        <w:spacing w:before="240" w:after="60"/>
+        <w:rPr>
+          <w:rFonts w:asciiTheme="minorHAnsi" w:eastAsia="Times New Roman" w:hAnsiTheme="minorHAnsi" w:cstheme="minorHAnsi"/>
+          <w:b/>
+          <w:bCs/>
+          <w:sz w:val="22"/>
+          <w:szCs w:val="22"/>
+          <w:lang w:val="en-US" w:eastAsia="sv-SE"/>
+        </w:rPr>
+      </w:pPr>
+      <w:r>
+        <w:rPr>
+          <w:rFonts w:asciiTheme="minorHAnsi" w:eastAsia="Times New Roman" w:hAnsiTheme="minorHAnsi" w:cstheme="minorHAnsi"/>
+          <w:b/>
+          <w:bCs/>
+          <w:sz w:val="22"/>
+          <w:szCs w:val="22"/>
+          <w:lang w:val="en-US" w:eastAsia="sv-SE"/>
+        </w:rPr>
+        <w:t xml:space="preserve">§ 7 Vacation for new employees</w:t>
+      </w:r>
+    </w:p>
+    <w:p>
+      <w:pPr>
+        <w:spacing w:before="0" w:after="120"/>
+        <w:rPr>
+          <w:rFonts w:asciiTheme="minorHAnsi" w:eastAsia="Times New Roman" w:hAnsiTheme="minorHAnsi" w:cstheme="minorHAnsi"/>
+          <w:sz w:val="20"/>
+          <w:szCs w:val="20"/>
+          <w:lang w:val="en-US" w:eastAsia="sv-SE"/>
+        </w:rPr>
+      </w:pPr>
+      <w:r>
+        <w:rPr>
+          <w:rFonts w:asciiTheme="minorHAnsi" w:eastAsia="Times New Roman" w:hAnsiTheme="minorHAnsi" w:cstheme="minorHAnsi"/>
+          <w:sz w:val="20"/>
+          <w:szCs w:val="20"/>
+          <w:lang w:val="en-US" w:eastAsia="sv-SE"/>
+        </w:rPr>
+        <w:t xml:space="preserve">New employees, who have not yet had a full accruement year, may take out vacation in advance (paid time off). A maximum of 20 days of advance vacation/paid leave may be taken. Vacation supplements are not paid. Advance holiday may not be saved. Upon termination of employment within 5 years, advance vacation is deducted from accrued vacation and wages. Upon termination of employment after 5 years, repayment of advance vacation is waived.</w:t>
+      </w:r>
+    </w:p>
+    <w:p>
+      <w:pPr>
+        <w:spacing w:before="0" w:after="120"/>
+        <w:rPr>
+          <w:rFonts w:asciiTheme="minorHAnsi" w:eastAsia="Times New Roman" w:hAnsiTheme="minorHAnsi" w:cstheme="minorHAnsi"/>
+          <w:sz w:val="20"/>
+          <w:szCs w:val="20"/>
+          <w:lang w:val="en-US" w:eastAsia="sv-SE"/>
+        </w:rPr>
+      </w:pPr>
+      <w:r>
+        <w:rPr>
+          <w:rFonts w:asciiTheme="minorHAnsi" w:eastAsia="Times New Roman" w:hAnsiTheme="minorHAnsi" w:cstheme="minorHAnsi"/>
+          <w:sz w:val="20"/>
+          <w:szCs w:val="20"/>
+          <w:lang w:val="en-US" w:eastAsia="sv-SE"/>
+        </w:rPr>
+        <w:t xml:space="preserve">An employee who begins employment between 1 April and 31 August has the right to 20 days of advance vacation and 5 days of unpaid vacation until 31 March of the following year.</w:t>
+      </w:r>
+    </w:p>
+    <w:p>
+      <w:pPr>
+        <w:spacing w:before="240" w:after="60"/>
+        <w:rPr>
+          <w:rFonts w:asciiTheme="minorHAnsi" w:eastAsia="Times New Roman" w:hAnsiTheme="minorHAnsi" w:cstheme="minorHAnsi"/>
+          <w:b/>
+          <w:bCs/>
+          <w:sz w:val="22"/>
+          <w:szCs w:val="22"/>
+          <w:lang w:val="en-US" w:eastAsia="sv-SE"/>
+        </w:rPr>
+      </w:pPr>
+      <w:r>
+        <w:rPr>
+          <w:rFonts w:asciiTheme="minorHAnsi" w:eastAsia="Times New Roman" w:hAnsiTheme="minorHAnsi" w:cstheme="minorHAnsi"/>
+          <w:b/>
+          <w:bCs/>
+          <w:sz w:val="22"/>
+          <w:szCs w:val="22"/>
+          <w:lang w:val="en-US" w:eastAsia="sv-SE"/>
+        </w:rPr>
+        <w:t xml:space="preserve">§ 8 Presence and absence reports</w:t>
+      </w:r>
+    </w:p>
+    <w:p>
+      <w:pPr>
+        <w:spacing w:before="0" w:after="120"/>
+        <w:rPr>
+          <w:rFonts w:asciiTheme="minorHAnsi" w:eastAsia="Times New Roman" w:hAnsiTheme="minorHAnsi" w:cstheme="minorHAnsi"/>
+          <w:sz w:val="20"/>
+          <w:szCs w:val="20"/>
+          <w:lang w:val="en-US" w:eastAsia="sv-SE"/>
+        </w:rPr>
+      </w:pPr>
+      <w:r>
+        <w:rPr>
+          <w:rFonts w:asciiTheme="minorHAnsi" w:eastAsia="Times New Roman" w:hAnsiTheme="minorHAnsi" w:cstheme="minorHAnsi"/>
+          <w:sz w:val="20"/>
+          <w:szCs w:val="20"/>
+          <w:lang w:val="en-US" w:eastAsia="sv-SE"/>
+        </w:rPr>
+        <w:t xml:space="preserve">Employees shall submit time reports once each calendar month according to the instructions published on the extranet and distributed via e-mail prior to each invoicing period.</w:t>
+      </w:r>
+    </w:p>
+    <w:p>
+      <w:pPr>
+        <w:spacing w:before="240" w:after="60"/>
+        <w:rPr>
+          <w:rFonts w:asciiTheme="minorHAnsi" w:eastAsia="Times New Roman" w:hAnsiTheme="minorHAnsi" w:cstheme="minorHAnsi"/>
+          <w:b/>
+          <w:bCs/>
+          <w:sz w:val="22"/>
+          <w:szCs w:val="22"/>
+          <w:lang w:val="en-US" w:eastAsia="sv-SE"/>
+        </w:rPr>
+      </w:pPr>
+      <w:r>
+        <w:rPr>
+          <w:rFonts w:asciiTheme="minorHAnsi" w:eastAsia="Times New Roman" w:hAnsiTheme="minorHAnsi" w:cstheme="minorHAnsi"/>
+          <w:b/>
+          <w:bCs/>
+          <w:sz w:val="22"/>
+          <w:szCs w:val="22"/>
+          <w:lang w:val="en-US" w:eastAsia="sv-SE"/>
+        </w:rPr>
+        <w:t xml:space="preserve">§ 9 Payment of salaries</w:t>
+      </w:r>
+    </w:p>
+    <w:p>
+      <w:pPr>
+        <w:spacing w:before="0" w:after="120"/>
+        <w:rPr>
+          <w:rFonts w:asciiTheme="minorHAnsi" w:eastAsia="Times New Roman" w:hAnsiTheme="minorHAnsi" w:cstheme="minorHAnsi"/>
+          <w:sz w:val="20"/>
+          <w:szCs w:val="20"/>
+          <w:lang w:val="en-US" w:eastAsia="sv-SE"/>
+        </w:rPr>
+      </w:pPr>
+      <w:r>
+        <w:rPr>
+          <w:rFonts w:asciiTheme="minorHAnsi" w:eastAsia="Times New Roman" w:hAnsiTheme="minorHAnsi" w:cstheme="minorHAnsi"/>
+          <w:sz w:val="20"/>
+          <w:szCs w:val="20"/>
+          <w:lang w:val="en-US" w:eastAsia="sv-SE"/>
+        </w:rPr>
+        <w:t xml:space="preserve">Salaries are paid once each calendar month on the 25th. If the 25th falls on a Saturday, Sunday or holiday, salaries are paid on the final weekday before this day. The monthly salaries are preliminary wages because deductions, supplements and adjustments are made during the following month based on the time reports.</w:t>
+      </w:r>
+    </w:p>
+    <w:p>
+      <w:pPr>
+        <w:spacing w:before="240" w:after="60"/>
+        <w:rPr>
+          <w:rFonts w:asciiTheme="minorHAnsi" w:eastAsia="Times New Roman" w:hAnsiTheme="minorHAnsi" w:cstheme="minorHAnsi"/>
+          <w:b/>
+          <w:bCs/>
+          <w:sz w:val="22"/>
+          <w:szCs w:val="22"/>
+          <w:lang w:val="en-US" w:eastAsia="sv-SE"/>
+        </w:rPr>
+      </w:pPr>
+      <w:r>
+        <w:rPr>
+          <w:rFonts w:asciiTheme="minorHAnsi" w:eastAsia="Times New Roman" w:hAnsiTheme="minorHAnsi" w:cstheme="minorHAnsi"/>
+          <w:b/>
+          <w:bCs/>
+          <w:sz w:val="22"/>
+          <w:szCs w:val="22"/>
+          <w:lang w:val="en-US" w:eastAsia="sv-SE"/>
+        </w:rPr>
+        <w:t xml:space="preserve">§ 10 Absence due to illness</w:t>
+      </w:r>
+    </w:p>
+    <w:p>
+      <w:pPr>
+        <w:spacing w:before="0" w:after="120"/>
+        <w:rPr>
+          <w:rFonts w:asciiTheme="minorHAnsi" w:eastAsia="Times New Roman" w:hAnsiTheme="minorHAnsi" w:cstheme="minorHAnsi"/>
+          <w:sz w:val="20"/>
+          <w:szCs w:val="20"/>
+          <w:lang w:val="en-US" w:eastAsia="sv-SE"/>
+        </w:rPr>
+      </w:pPr>
+      <w:r>
+        <w:rPr>
+          <w:rFonts w:asciiTheme="minorHAnsi" w:eastAsia="Times New Roman" w:hAnsiTheme="minorHAnsi" w:cstheme="minorHAnsi"/>
+          <w:sz w:val="20"/>
+          <w:szCs w:val="20"/>
+          <w:lang w:val="en-US" w:eastAsia="sv-SE"/>
+        </w:rPr>
+        <w:t xml:space="preserve">During the first 14 days of a period of illness, employees have the legal right to receive sick pay from the employer. Sick pay is set to 80% of the income on which sick pay is based.</w:t>
+      </w:r>
+    </w:p>
+    <w:p>
+      <w:pPr>
+        <w:spacing w:before="0" w:after="120"/>
+        <w:rPr>
+          <w:rFonts w:asciiTheme="minorHAnsi" w:eastAsia="Times New Roman" w:hAnsiTheme="minorHAnsi" w:cstheme="minorHAnsi"/>
+          <w:sz w:val="20"/>
+          <w:szCs w:val="20"/>
+          <w:lang w:val="en-US" w:eastAsia="sv-SE"/>
+        </w:rPr>
+      </w:pPr>
+      <w:r>
+        <w:rPr>
+          <w:rFonts w:asciiTheme="minorHAnsi" w:eastAsia="Times New Roman" w:hAnsiTheme="minorHAnsi" w:cstheme="minorHAnsi"/>
+          <w:sz w:val="20"/>
+          <w:szCs w:val="20"/>
+          <w:lang w:val="en-US" w:eastAsia="sv-SE"/>
+        </w:rPr>
+        <w:t xml:space="preserve">Responsibility for payment does not apply if the employee is receiving preventive sick pay, is participating in rehabilitation that provides the right to rehabilitation compensation, is partially absent from work because of illness or is covered by individual high-risk insurance.</w:t>
+      </w:r>
+    </w:p>
+    <w:p>
+      <w:pPr>
+        <w:spacing w:before="0" w:after="120"/>
+        <w:rPr>
+          <w:rFonts w:asciiTheme="minorHAnsi" w:eastAsia="Times New Roman" w:hAnsiTheme="minorHAnsi" w:cstheme="minorHAnsi"/>
+          <w:sz w:val="20"/>
+          <w:szCs w:val="20"/>
+          <w:lang w:val="en-US" w:eastAsia="sv-SE"/>
+        </w:rPr>
+      </w:pPr>
+      <w:r>
+        <w:rPr>
+          <w:rFonts w:asciiTheme="minorHAnsi" w:eastAsia="Times New Roman" w:hAnsiTheme="minorHAnsi" w:cstheme="minorHAnsi"/>
+          <w:sz w:val="20"/>
+          <w:szCs w:val="20"/>
+          <w:lang w:val="en-US" w:eastAsia="sv-SE"/>
+        </w:rPr>
+        <w:t xml:space="preserve">Sick pay is not paid for the first day of absence, which is a qualifying day. It is not permitted to take out compensatory leave or holiday during the qualifying day. This only means that the first day of absence because of illness is moved forward. If an employee becomes ill again within five calendar days from the end of the sick pay period, there is no new qualifying day. Starting at and including the eighth calendar day a certificate of illness is required.</w:t>
+      </w:r>
+    </w:p>
+    <w:p>
+      <w:pPr>
+        <w:spacing w:before="240" w:after="60"/>
+        <w:rPr>
+          <w:rFonts w:asciiTheme="minorHAnsi" w:eastAsia="Times New Roman" w:hAnsiTheme="minorHAnsi" w:cstheme="minorHAnsi"/>
+          <w:b/>
+          <w:bCs/>
+          <w:sz w:val="22"/>
+          <w:szCs w:val="22"/>
+          <w:lang w:val="en-US" w:eastAsia="sv-SE"/>
+        </w:rPr>
+      </w:pPr>
+      <w:r>
+        <w:rPr>
+          <w:rFonts w:asciiTheme="minorHAnsi" w:eastAsia="Times New Roman" w:hAnsiTheme="minorHAnsi" w:cstheme="minorHAnsi"/>
+          <w:b/>
+          <w:bCs/>
+          <w:sz w:val="22"/>
+          <w:szCs w:val="22"/>
+          <w:lang w:val="en-US" w:eastAsia="sv-SE"/>
+        </w:rPr>
+        <w:t xml:space="preserve">§ 11 Healthcare and medical services</w:t>
+      </w:r>
+    </w:p>
+    <w:p>
+      <w:pPr>
+        <w:spacing w:before="0" w:after="120"/>
+        <w:rPr>
+          <w:rFonts w:asciiTheme="minorHAnsi" w:eastAsia="Times New Roman" w:hAnsiTheme="minorHAnsi" w:cstheme="minorHAnsi"/>
+          <w:sz w:val="20"/>
+          <w:szCs w:val="20"/>
+          <w:lang w:val="en-US" w:eastAsia="sv-SE"/>
+        </w:rPr>
+      </w:pPr>
+      <w:r>
+        <w:rPr>
+          <w:rFonts w:asciiTheme="minorHAnsi" w:eastAsia="Times New Roman" w:hAnsiTheme="minorHAnsi" w:cstheme="minorHAnsi"/>
+          <w:sz w:val="20"/>
+          <w:szCs w:val="20"/>
+          <w:lang w:val="en-US" w:eastAsia="sv-SE"/>
+        </w:rPr>
+        <w:t xml:space="preserve">Sigma Technology provides massage services at some sites that can prevent problems with neck ailments, mouse arm, etc.</w:t>
+      </w:r>
+    </w:p>
+    <w:p>
+      <w:pPr>
+        <w:spacing w:before="0" w:after="120"/>
+        <w:rPr>
+          <w:rFonts w:asciiTheme="minorHAnsi" w:eastAsia="Times New Roman" w:hAnsiTheme="minorHAnsi" w:cstheme="minorHAnsi"/>
+          <w:sz w:val="20"/>
+          <w:szCs w:val="20"/>
+          <w:lang w:val="en-US" w:eastAsia="sv-SE"/>
+        </w:rPr>
+      </w:pPr>
+      <w:r>
+        <w:rPr>
+          <w:rFonts w:asciiTheme="minorHAnsi" w:eastAsia="Times New Roman" w:hAnsiTheme="minorHAnsi" w:cstheme="minorHAnsi"/>
+          <w:sz w:val="20"/>
+          <w:szCs w:val="20"/>
+          <w:lang w:val="en-US" w:eastAsia="sv-SE"/>
+        </w:rPr>
+        <w:t xml:space="preserve">Sigma Technology also pays for vaccinations or medical examinations needed for conducting assignments in other countries where this is necessary, such as countries in Asia, etc.</w:t>
+      </w:r>
+    </w:p>
+    <w:p>
+      <w:pPr>
+        <w:spacing w:before="0" w:after="120"/>
+        <w:rPr>
+          <w:rFonts w:asciiTheme="minorHAnsi" w:eastAsia="Times New Roman" w:hAnsiTheme="minorHAnsi" w:cstheme="minorHAnsi"/>
+          <w:sz w:val="20"/>
+          <w:szCs w:val="20"/>
+          <w:lang w:val="en-US" w:eastAsia="sv-SE"/>
+        </w:rPr>
+      </w:pPr>
+      <w:r>
+        <w:rPr>
+          <w:rFonts w:asciiTheme="minorHAnsi" w:eastAsia="Times New Roman" w:hAnsiTheme="minorHAnsi" w:cstheme="minorHAnsi"/>
+          <w:sz w:val="20"/>
+          <w:szCs w:val="20"/>
+          <w:lang w:val="en-US" w:eastAsia="sv-SE"/>
+        </w:rPr>
+        <w:t xml:space="preserve">For all other care, such as visits to doctors, etc. contact public medical services; Sigma Technology does not provide this type of benefit. However, you can take out private medical insurance at a reduced rate via our agreement with our insurance company.</w:t>
+      </w:r>
+    </w:p>
+    <w:p>
+      <w:pPr>
+        <w:spacing w:before="240" w:after="60"/>
+        <w:rPr>
+          <w:rFonts w:asciiTheme="minorHAnsi" w:eastAsia="Times New Roman" w:hAnsiTheme="minorHAnsi" w:cstheme="minorHAnsi"/>
+          <w:b/>
+          <w:bCs/>
+          <w:sz w:val="22"/>
+          <w:szCs w:val="22"/>
+          <w:lang w:val="en-US" w:eastAsia="sv-SE"/>
+        </w:rPr>
+      </w:pPr>
+      <w:r>
+        <w:rPr>
+          <w:rFonts w:asciiTheme="minorHAnsi" w:eastAsia="Times New Roman" w:hAnsiTheme="minorHAnsi" w:cstheme="minorHAnsi"/>
+          <w:b/>
+          <w:bCs/>
+          <w:sz w:val="22"/>
+          <w:szCs w:val="22"/>
+          <w:lang w:val="en-US" w:eastAsia="sv-SE"/>
+        </w:rPr>
+        <w:t xml:space="preserve">§ 12 Alcohol and other drugs</w:t>
+      </w:r>
+    </w:p>
+    <w:p>
+      <w:pPr>
+        <w:spacing w:before="0" w:after="120"/>
+        <w:rPr>
+          <w:rFonts w:asciiTheme="minorHAnsi" w:eastAsia="Times New Roman" w:hAnsiTheme="minorHAnsi" w:cstheme="minorHAnsi"/>
+          <w:sz w:val="20"/>
+          <w:szCs w:val="20"/>
+          <w:lang w:val="en-US" w:eastAsia="sv-SE"/>
+        </w:rPr>
+      </w:pPr>
+      <w:r>
+        <w:rPr>
+          <w:rFonts w:asciiTheme="minorHAnsi" w:eastAsia="Times New Roman" w:hAnsiTheme="minorHAnsi" w:cstheme="minorHAnsi"/>
+          <w:sz w:val="20"/>
+          <w:szCs w:val="20"/>
+          <w:lang w:val="en-US" w:eastAsia="sv-SE"/>
+        </w:rPr>
+        <w:t xml:space="preserve">At Sigma Technology, employees must be entirely free from the influence of drugs (alcohol and narcotics) during working hours. The reasons behind this rule are related to, for example, safety aspects, performance aspects, certain direct requirements from our clients, and naturally, consideration to you as an employee.</w:t>
+      </w:r>
+    </w:p>
+    <w:p>
+      <w:pPr>
+        <w:spacing w:before="0" w:after="120"/>
+        <w:rPr>
+          <w:rFonts w:asciiTheme="minorHAnsi" w:eastAsia="Times New Roman" w:hAnsiTheme="minorHAnsi" w:cstheme="minorHAnsi"/>
+          <w:sz w:val="20"/>
+          <w:szCs w:val="20"/>
+          <w:lang w:val="en-US" w:eastAsia="sv-SE"/>
+        </w:rPr>
+      </w:pPr>
+      <w:r>
+        <w:rPr>
+          <w:rFonts w:asciiTheme="minorHAnsi" w:eastAsia="Times New Roman" w:hAnsiTheme="minorHAnsi" w:cstheme="minorHAnsi"/>
+          <w:sz w:val="20"/>
+          <w:szCs w:val="20"/>
+          <w:lang w:val="en-US" w:eastAsia="sv-SE"/>
+        </w:rPr>
+        <w:t xml:space="preserve">Sigma Technology therefore has the right to conduct drug testing as appropriate. This may be done in the form of random checks or prior to special assignments.</w:t>
+      </w:r>
+    </w:p>
+    <w:p>
+      <w:pPr>
+        <w:spacing w:before="0" w:after="120"/>
+        <w:rPr>
+          <w:rFonts w:asciiTheme="minorHAnsi" w:eastAsia="Times New Roman" w:hAnsiTheme="minorHAnsi" w:cstheme="minorHAnsi"/>
+          <w:sz w:val="20"/>
+          <w:szCs w:val="20"/>
+          <w:lang w:val="en-US" w:eastAsia="sv-SE"/>
+        </w:rPr>
+      </w:pPr>
+      <w:r>
+        <w:rPr>
+          <w:rFonts w:asciiTheme="minorHAnsi" w:eastAsia="Times New Roman" w:hAnsiTheme="minorHAnsi" w:cstheme="minorHAnsi"/>
+          <w:sz w:val="20"/>
+          <w:szCs w:val="20"/>
+          <w:lang w:val="en-US" w:eastAsia="sv-SE"/>
+        </w:rPr>
+        <w:t xml:space="preserve">Those taking prescription drugs that can produce effects or side-effects that may be perceived by others as the user being under the influence of alcohol or narcotics shall notify their manager of this to avoid any misunderstandings.</w:t>
+      </w:r>
+    </w:p>
+    <w:p>
+      <w:pPr>
+        <w:spacing w:before="240" w:after="60"/>
+        <w:rPr>
+          <w:rFonts w:asciiTheme="minorHAnsi" w:eastAsia="Times New Roman" w:hAnsiTheme="minorHAnsi" w:cstheme="minorHAnsi"/>
+          <w:b/>
+          <w:bCs/>
+          <w:sz w:val="22"/>
+          <w:szCs w:val="22"/>
+          <w:lang w:val="en-US" w:eastAsia="sv-SE"/>
+        </w:rPr>
+      </w:pPr>
+      <w:r>
+        <w:rPr>
+          <w:rFonts w:asciiTheme="minorHAnsi" w:eastAsia="Times New Roman" w:hAnsiTheme="minorHAnsi" w:cstheme="minorHAnsi"/>
+          <w:b/>
+          <w:bCs/>
+          <w:sz w:val="22"/>
+          <w:szCs w:val="22"/>
+          <w:lang w:val="en-US" w:eastAsia="sv-SE"/>
+        </w:rPr>
+        <w:t xml:space="preserve">§ 13 Assignments outside the company</w:t>
+      </w:r>
+    </w:p>
+    <w:p>
+      <w:pPr>
+        <w:spacing w:before="0" w:after="120"/>
+        <w:rPr>
+          <w:rFonts w:asciiTheme="minorHAnsi" w:eastAsia="Times New Roman" w:hAnsiTheme="minorHAnsi" w:cstheme="minorHAnsi"/>
+          <w:sz w:val="20"/>
+          <w:szCs w:val="20"/>
+          <w:lang w:val="en-US" w:eastAsia="sv-SE"/>
+        </w:rPr>
+      </w:pPr>
+      <w:r>
+        <w:rPr>
+          <w:rFonts w:asciiTheme="minorHAnsi" w:eastAsia="Times New Roman" w:hAnsiTheme="minorHAnsi" w:cstheme="minorHAnsi"/>
+          <w:sz w:val="20"/>
+          <w:szCs w:val="20"/>
+          <w:lang w:val="en-US" w:eastAsia="sv-SE"/>
+        </w:rPr>
+        <w:t xml:space="preserve">Employees are obligated to devote their working hours, attention and skills to their employment at the company and do not have the right to conduct professional assignments beyond the conditions of employment without written permission.</w:t>
+      </w:r>
+    </w:p>
+    <w:p>
+      <w:pPr>
+        <w:spacing w:before="240" w:after="60"/>
+        <w:rPr>
+          <w:rFonts w:asciiTheme="minorHAnsi" w:eastAsia="Times New Roman" w:hAnsiTheme="minorHAnsi" w:cstheme="minorHAnsi"/>
+          <w:b/>
+          <w:bCs/>
+          <w:sz w:val="22"/>
+          <w:szCs w:val="22"/>
+          <w:lang w:val="en-US" w:eastAsia="sv-SE"/>
+        </w:rPr>
+      </w:pPr>
+      <w:r>
+        <w:rPr>
+          <w:rFonts w:asciiTheme="minorHAnsi" w:eastAsia="Times New Roman" w:hAnsiTheme="minorHAnsi" w:cstheme="minorHAnsi"/>
+          <w:b/>
+          <w:bCs/>
+          <w:sz w:val="22"/>
+          <w:szCs w:val="22"/>
+          <w:lang w:val="en-US" w:eastAsia="sv-SE"/>
+        </w:rPr>
+        <w:t xml:space="preserve">§ 14 Competition and loyalty</w:t>
+      </w:r>
+    </w:p>
+    <w:p>
+      <w:pPr>
+        <w:spacing w:before="0" w:after="120"/>
+        <w:rPr>
+          <w:rFonts w:asciiTheme="minorHAnsi" w:eastAsia="Times New Roman" w:hAnsiTheme="minorHAnsi" w:cstheme="minorHAnsi"/>
+          <w:sz w:val="20"/>
+          <w:szCs w:val="20"/>
+          <w:lang w:val="en-US" w:eastAsia="sv-SE"/>
+        </w:rPr>
+      </w:pPr>
+      <w:r>
+        <w:rPr>
+          <w:rFonts w:asciiTheme="minorHAnsi" w:eastAsia="Times New Roman" w:hAnsiTheme="minorHAnsi" w:cstheme="minorHAnsi"/>
+          <w:sz w:val="20"/>
+          <w:szCs w:val="20"/>
+          <w:lang w:val="en-US" w:eastAsia="sv-SE"/>
+        </w:rPr>
+        <w:t xml:space="preserve">The employee may not take on assignments or engage in activities that could have a negative impact on the company or the work. Employees may neither directly nor indirectly devote themselves or otherwise have interests in activities that compete with the company’s activities, and furthermore, may not serve as advisers to competing companies.</w:t>
+      </w:r>
+    </w:p>
+    <w:p>
+      <w:pPr>
+        <w:spacing w:before="0" w:after="120"/>
+        <w:rPr>
+          <w:rFonts w:asciiTheme="minorHAnsi" w:eastAsia="Times New Roman" w:hAnsiTheme="minorHAnsi" w:cstheme="minorHAnsi"/>
+          <w:sz w:val="20"/>
+          <w:szCs w:val="20"/>
+          <w:lang w:val="en-US" w:eastAsia="sv-SE"/>
+        </w:rPr>
+      </w:pPr>
+      <w:r>
+        <w:rPr>
+          <w:rFonts w:asciiTheme="minorHAnsi" w:eastAsia="Times New Roman" w:hAnsiTheme="minorHAnsi" w:cstheme="minorHAnsi"/>
+          <w:sz w:val="20"/>
+          <w:szCs w:val="20"/>
+          <w:lang w:val="en-US" w:eastAsia="sv-SE"/>
+        </w:rPr>
+        <w:t xml:space="preserve">An employee may neither directly nor indirectly recruit personnel from the Sigma Group within 6 months of termination of employment. This does not apply if the employee has moved to a non-competing activity.</w:t>
+      </w:r>
+    </w:p>
+    <w:p>
+      <w:pPr>
+        <w:spacing w:before="240" w:after="60"/>
+        <w:rPr>
+          <w:rFonts w:asciiTheme="minorHAnsi" w:eastAsia="Times New Roman" w:hAnsiTheme="minorHAnsi" w:cstheme="minorHAnsi"/>
+          <w:b/>
+          <w:bCs/>
+          <w:sz w:val="22"/>
+          <w:szCs w:val="22"/>
+          <w:lang w:val="en-US" w:eastAsia="sv-SE"/>
+        </w:rPr>
+      </w:pPr>
+      <w:r>
+        <w:rPr>
+          <w:rFonts w:asciiTheme="minorHAnsi" w:eastAsia="Times New Roman" w:hAnsiTheme="minorHAnsi" w:cstheme="minorHAnsi"/>
+          <w:b/>
+          <w:bCs/>
+          <w:sz w:val="22"/>
+          <w:szCs w:val="22"/>
+          <w:lang w:val="en-US" w:eastAsia="sv-SE"/>
+        </w:rPr>
+        <w:t xml:space="preserve">§15 Confidentiality</w:t>
+      </w:r>
+    </w:p>
+    <w:p>
+      <w:pPr>
+        <w:spacing w:before="0" w:after="120"/>
+        <w:rPr>
+          <w:rFonts w:asciiTheme="minorHAnsi" w:eastAsia="Times New Roman" w:hAnsiTheme="minorHAnsi" w:cstheme="minorHAnsi"/>
+          <w:sz w:val="20"/>
+          <w:szCs w:val="20"/>
+          <w:lang w:val="en-US" w:eastAsia="sv-SE"/>
+        </w:rPr>
+      </w:pPr>
+      <w:r>
+        <w:rPr>
+          <w:rFonts w:asciiTheme="minorHAnsi" w:eastAsia="Times New Roman" w:hAnsiTheme="minorHAnsi" w:cstheme="minorHAnsi"/>
+          <w:sz w:val="20"/>
+          <w:szCs w:val="20"/>
+          <w:lang w:val="en-US" w:eastAsia="sv-SE"/>
+        </w:rPr>
+        <w:t xml:space="preserve">It is the responsibility of each employee to observe complete confidentiality regarding information that can be considered as sensitive in nature or that can constitute business secrets for the company or the Sigma Group, that an employee may gain knowledge of in his or her capacity as a consultant. This duty of confidentiality also applies after the employee has ceased to be employed by the company.</w:t>
+      </w:r>
+    </w:p>
+    <w:p>
+      <w:pPr>
+        <w:spacing w:before="240" w:after="60"/>
+        <w:rPr>
+          <w:rFonts w:asciiTheme="minorHAnsi" w:eastAsia="Times New Roman" w:hAnsiTheme="minorHAnsi" w:cstheme="minorHAnsi"/>
+          <w:b/>
+          <w:bCs/>
+          <w:sz w:val="22"/>
+          <w:szCs w:val="22"/>
+          <w:lang w:val="en-US" w:eastAsia="sv-SE"/>
+        </w:rPr>
+      </w:pPr>
+      <w:r>
+        <w:rPr>
+          <w:rFonts w:asciiTheme="minorHAnsi" w:eastAsia="Times New Roman" w:hAnsiTheme="minorHAnsi" w:cstheme="minorHAnsi"/>
+          <w:b/>
+          <w:bCs/>
+          <w:sz w:val="22"/>
+          <w:szCs w:val="22"/>
+          <w:lang w:val="en-US" w:eastAsia="sv-SE"/>
+        </w:rPr>
+        <w:t xml:space="preserve">§ 16 Ownership</w:t>
+      </w:r>
+    </w:p>
+    <w:p>
+      <w:pPr>
+        <w:spacing w:before="0" w:after="120"/>
+        <w:rPr>
+          <w:rFonts w:asciiTheme="minorHAnsi" w:eastAsia="Times New Roman" w:hAnsiTheme="minorHAnsi" w:cstheme="minorHAnsi"/>
+          <w:sz w:val="20"/>
+          <w:szCs w:val="20"/>
+          <w:lang w:val="en-US" w:eastAsia="sv-SE"/>
+        </w:rPr>
+      </w:pPr>
+      <w:r>
+        <w:rPr>
+          <w:rFonts w:asciiTheme="minorHAnsi" w:eastAsia="Times New Roman" w:hAnsiTheme="minorHAnsi" w:cstheme="minorHAnsi"/>
+          <w:sz w:val="20"/>
+          <w:szCs w:val="20"/>
+          <w:lang w:val="en-US" w:eastAsia="sv-SE"/>
+        </w:rPr>
+        <w:t xml:space="preserve">When an employee leaves his or her position, regardless of reason, he or she must immediately turn in all materials that belong to the company and/or the Sigma Group.</w:t>
+      </w:r>
+    </w:p>
+    <w:p>
+      <w:pPr>
+        <w:spacing w:before="240" w:after="60"/>
+        <w:rPr>
+          <w:rFonts w:asciiTheme="minorHAnsi" w:eastAsia="Times New Roman" w:hAnsiTheme="minorHAnsi" w:cstheme="minorHAnsi"/>
+          <w:b/>
+          <w:bCs/>
+          <w:sz w:val="22"/>
+          <w:szCs w:val="22"/>
+          <w:lang w:val="en-US" w:eastAsia="sv-SE"/>
+        </w:rPr>
+      </w:pPr>
+      <w:r>
+        <w:rPr>
+          <w:rFonts w:asciiTheme="minorHAnsi" w:eastAsia="Times New Roman" w:hAnsiTheme="minorHAnsi" w:cstheme="minorHAnsi"/>
+          <w:b/>
+          <w:bCs/>
+          <w:sz w:val="22"/>
+          <w:szCs w:val="22"/>
+          <w:lang w:val="en-US" w:eastAsia="sv-SE"/>
+        </w:rPr>
+        <w:t xml:space="preserve">§ 17 Copyrights</w:t>
+      </w:r>
+    </w:p>
+    <w:p>
+      <w:pPr>
+        <w:spacing w:before="0" w:after="120"/>
+        <w:rPr>
+          <w:rFonts w:asciiTheme="minorHAnsi" w:eastAsia="Times New Roman" w:hAnsiTheme="minorHAnsi" w:cstheme="minorHAnsi"/>
+          <w:sz w:val="20"/>
+          <w:szCs w:val="20"/>
+          <w:lang w:val="en-US" w:eastAsia="sv-SE"/>
+        </w:rPr>
+      </w:pPr>
+      <w:r>
+        <w:rPr>
+          <w:rFonts w:asciiTheme="minorHAnsi" w:eastAsia="Times New Roman" w:hAnsiTheme="minorHAnsi" w:cstheme="minorHAnsi"/>
+          <w:sz w:val="20"/>
+          <w:szCs w:val="20"/>
+          <w:lang w:val="en-US" w:eastAsia="sv-SE"/>
+        </w:rPr>
+        <w:t xml:space="preserve">Copyrights or any other rights to inventions, patents, etc. that an employee fully or partially develops during his or her employment are the property of the company.</w:t>
+      </w:r>
+    </w:p>
+    <w:p>
+      <w:pPr>
+        <w:spacing w:before="240" w:after="60"/>
+        <w:rPr>
+          <w:rFonts w:asciiTheme="minorHAnsi" w:eastAsia="Times New Roman" w:hAnsiTheme="minorHAnsi" w:cstheme="minorHAnsi"/>
+          <w:b/>
+          <w:bCs/>
+          <w:sz w:val="22"/>
+          <w:szCs w:val="22"/>
+          <w:lang w:val="en-US" w:eastAsia="sv-SE"/>
+        </w:rPr>
+      </w:pPr>
+      <w:r>
+        <w:rPr>
+          <w:rFonts w:asciiTheme="minorHAnsi" w:eastAsia="Times New Roman" w:hAnsiTheme="minorHAnsi" w:cstheme="minorHAnsi"/>
+          <w:b/>
+          <w:bCs/>
+          <w:sz w:val="22"/>
+          <w:szCs w:val="22"/>
+          <w:lang w:val="en-US" w:eastAsia="sv-SE"/>
+        </w:rPr>
+        <w:t xml:space="preserve">§ 18 Pension</w:t>
+      </w:r>
+    </w:p>
+    <w:p>
+      <w:pPr>
+        <w:spacing w:before="0" w:after="120"/>
+        <w:rPr>
+          <w:rFonts w:asciiTheme="minorHAnsi" w:eastAsia="Times New Roman" w:hAnsiTheme="minorHAnsi" w:cstheme="minorHAnsi"/>
+          <w:sz w:val="20"/>
+          <w:szCs w:val="20"/>
+          <w:lang w:val="en-US" w:eastAsia="sv-SE"/>
+        </w:rPr>
+      </w:pPr>
+      <w:r>
+        <w:rPr>
+          <w:rFonts w:asciiTheme="minorHAnsi" w:eastAsia="Times New Roman" w:hAnsiTheme="minorHAnsi" w:cstheme="minorHAnsi"/>
+          <w:sz w:val="20"/>
+          <w:szCs w:val="20"/>
+          <w:lang w:val="en-US" w:eastAsia="sv-SE"/>
+        </w:rPr>
+        <w:t xml:space="preserve">All employees get ITP pension according to the Collective Agreement.</w:t>
+      </w:r>
+    </w:p>
+    <w:p>
+      <w:pPr>
+        <w:spacing w:before="0" w:after="120"/>
+        <w:rPr>
+          <w:rFonts w:asciiTheme="minorHAnsi" w:eastAsia="Times New Roman" w:hAnsiTheme="minorHAnsi" w:cstheme="minorHAnsi"/>
+          <w:sz w:val="20"/>
+          <w:szCs w:val="20"/>
+          <w:lang w:val="en-US" w:eastAsia="sv-SE"/>
+        </w:rPr>
+      </w:pPr>
+      <w:r>
+        <w:rPr>
+          <w:rFonts w:asciiTheme="minorHAnsi" w:eastAsia="Times New Roman" w:hAnsiTheme="minorHAnsi" w:cstheme="minorHAnsi"/>
+          <w:sz w:val="20"/>
+          <w:szCs w:val="20"/>
+          <w:lang w:val="en-US" w:eastAsia="sv-SE"/>
+        </w:rPr>
+        <w:t xml:space="preserve">(The employer reserves the right to negotiate accrued pension rights in special ITP2 cases in which the employee is not covered by ITP plans or equivalents.)</w:t>
+      </w:r>
+    </w:p>
+    <w:p>
+      <w:pPr>
+        <w:spacing w:before="0" w:after="120"/>
+        <w:rPr>
+          <w:rFonts w:asciiTheme="minorHAnsi" w:eastAsia="Times New Roman" w:hAnsiTheme="minorHAnsi" w:cstheme="minorHAnsi"/>
+          <w:sz w:val="20"/>
+          <w:szCs w:val="20"/>
+          <w:lang w:val="en-US" w:eastAsia="sv-SE"/>
+        </w:rPr>
+      </w:pPr>
+      <w:r>
+        <w:rPr>
+          <w:rFonts w:asciiTheme="minorHAnsi" w:eastAsia="Times New Roman" w:hAnsiTheme="minorHAnsi" w:cstheme="minorHAnsi"/>
+          <w:sz w:val="20"/>
+          <w:szCs w:val="20"/>
+          <w:lang w:val="en-US" w:eastAsia="sv-SE"/>
+        </w:rPr>
+        <w:t xml:space="preserve">Because the company has a collective agreement, this occupational pension is placed with Alecta. Your occupational pension includes an occupational group life insurance (TGL) and if you live with someone with whom you are not married, it is important that you specify a beneficiary in that common law spouses do not automatically receive benefits.</w:t>
+      </w:r>
+    </w:p>
+    <w:p>
+      <w:pPr>
+        <w:spacing w:before="0" w:after="120"/>
+        <w:rPr>
+          <w:rFonts w:asciiTheme="minorHAnsi" w:eastAsia="Times New Roman" w:hAnsiTheme="minorHAnsi" w:cstheme="minorHAnsi"/>
+          <w:sz w:val="20"/>
+          <w:szCs w:val="20"/>
+          <w:lang w:val="en-US" w:eastAsia="sv-SE"/>
+        </w:rPr>
+      </w:pPr>
+      <w:r>
+        <w:rPr>
+          <w:rFonts w:asciiTheme="minorHAnsi" w:eastAsia="Times New Roman" w:hAnsiTheme="minorHAnsi" w:cstheme="minorHAnsi"/>
+          <w:sz w:val="20"/>
+          <w:szCs w:val="20"/>
+          <w:lang w:val="en-US" w:eastAsia="sv-SE"/>
+        </w:rPr>
+        <w:t xml:space="preserve">You must arrange this yourself and ensure that notification is sent to Alecta.</w:t>
+      </w:r>
+    </w:p>
+    <w:p>
+      <w:pPr>
+        <w:spacing w:before="240" w:after="60"/>
+        <w:rPr>
+          <w:rFonts w:asciiTheme="minorHAnsi" w:eastAsia="Times New Roman" w:hAnsiTheme="minorHAnsi" w:cstheme="minorHAnsi"/>
+          <w:b/>
+          <w:bCs/>
+          <w:sz w:val="22"/>
+          <w:szCs w:val="22"/>
+          <w:lang w:val="en-US" w:eastAsia="sv-SE"/>
+        </w:rPr>
+      </w:pPr>
+      <w:r>
+        <w:rPr>
+          <w:rFonts w:asciiTheme="minorHAnsi" w:eastAsia="Times New Roman" w:hAnsiTheme="minorHAnsi" w:cstheme="minorHAnsi"/>
+          <w:b/>
+          <w:bCs/>
+          <w:sz w:val="22"/>
+          <w:szCs w:val="22"/>
+          <w:lang w:val="en-US" w:eastAsia="sv-SE"/>
+        </w:rPr>
+        <w:t xml:space="preserve">§ 19 Uthyrningslagen - ”24-month rule, the Rental Act”</w:t>
+      </w:r>
+    </w:p>
+    <w:p>
+      <w:pPr>
+        <w:spacing w:before="0" w:after="120"/>
+        <w:rPr>
+          <w:rFonts w:asciiTheme="minorHAnsi" w:eastAsia="Times New Roman" w:hAnsiTheme="minorHAnsi" w:cstheme="minorHAnsi"/>
+          <w:sz w:val="20"/>
+          <w:szCs w:val="20"/>
+          <w:lang w:val="en-US" w:eastAsia="sv-SE"/>
+        </w:rPr>
+      </w:pPr>
+      <w:r>
+        <w:rPr>
+          <w:rFonts w:asciiTheme="minorHAnsi" w:eastAsia="Times New Roman" w:hAnsiTheme="minorHAnsi" w:cstheme="minorHAnsi"/>
+          <w:sz w:val="20"/>
+          <w:szCs w:val="20"/>
+          <w:lang w:val="en-US" w:eastAsia="sv-SE"/>
+        </w:rPr>
+        <w:t xml:space="preserve">The employee is hired to work in various delivery formats that may vary depending on the preferences and needs of the customer. Thus, the company is not a staffing agency, therefore neither the employee nor the company is covered by the Rental Act. This applies regardless of the nature of the employee's assignment in the individual case.</w:t>
+      </w:r>
+    </w:p>
+    <w:p>
+      <w:pPr>
+        <w:spacing w:before="240" w:after="60"/>
+        <w:rPr>
+          <w:rFonts w:asciiTheme="minorHAnsi" w:eastAsia="Times New Roman" w:hAnsiTheme="minorHAnsi" w:cstheme="minorHAnsi"/>
+          <w:b/>
+          <w:bCs/>
+          <w:sz w:val="22"/>
+          <w:szCs w:val="22"/>
+          <w:lang w:val="en-US" w:eastAsia="sv-SE"/>
+        </w:rPr>
+      </w:pPr>
+      <w:r>
+        <w:rPr>
+          <w:rFonts w:asciiTheme="minorHAnsi" w:eastAsia="Times New Roman" w:hAnsiTheme="minorHAnsi" w:cstheme="minorHAnsi"/>
+          <w:b/>
+          <w:bCs/>
+          <w:sz w:val="22"/>
+          <w:szCs w:val="22"/>
+          <w:lang w:val="en-US" w:eastAsia="sv-SE"/>
+        </w:rPr>
+        <w:t xml:space="preserve">§ 20 Personal Data</w:t>
+      </w:r>
+    </w:p>
+    <w:p>
+      <w:pPr>
+        <w:spacing w:before="0" w:after="120"/>
+        <w:rPr>
+          <w:rFonts w:asciiTheme="minorHAnsi" w:eastAsia="Times New Roman" w:hAnsiTheme="minorHAnsi" w:cstheme="minorHAnsi"/>
+          <w:sz w:val="20"/>
+          <w:szCs w:val="20"/>
+          <w:lang w:val="en-US" w:eastAsia="sv-SE"/>
+        </w:rPr>
+      </w:pPr>
+      <w:r>
+        <w:rPr>
+          <w:rFonts w:asciiTheme="minorHAnsi" w:eastAsia="Times New Roman" w:hAnsiTheme="minorHAnsi" w:cstheme="minorHAnsi"/>
+          <w:sz w:val="20"/>
+          <w:szCs w:val="20"/>
+          <w:lang w:val="en-US" w:eastAsia="sv-SE"/>
+        </w:rPr>
+        <w:t xml:space="preserve">The company will process personal data in order to fulfill the obligations as an employer, as well as to manage and provide services, IT support and systems that is subject to the employment. The company’s right to process personal information (such as name, social security number, photo, address, telephone number, CV information etc.) is based on law, contract agreements, and legitimate interests.</w:t>
+      </w:r>
     </w:p>
     <w:sectPr>
       <w:headerReference w:type="even" r:id="rId10"/>

</xml_diff>